<commit_message>
fix(cluster-3): adversarial-review fix wave, SF1 to SF7 and N2/N3/N6/N8/N9
Template library: missing-input slot rule (SF1/N7), TPL-04 reworded off
the internal record name and stage (SF2), three claims trimmed to
register wording (SF3), the re_engagement suppression gate stated (SF7),
segment article fix (N6). Screen: whole-section deny list plus
unknown-line trap with a by-name mutation receipt (SF4), en-dash check
(N2), sidecar last_reviewed guard (N8). Generator: provider renamed
Quenwick Data with a determinism receipt (N3), argmax comment reworded
to the rule (N9). Test: T4 joins the frozen REV-01 master directly for
the suppression interplay (SF6). Spec: C3-P5 attribution clause (SF5).
MANIFEST regenerated. B1 is cured plan-side (B13/B14, trazomo f5d0c8bd);
N1/N4/N5/N10 declined with reasons in the review record.

Co-Authored-By: Claude Fable 5 <noreply@anthropic.com>
Claude-Session: 7e82173b-3325-45bd-9117-a5fcd54fdd9f
</commit_message>
<xml_diff>
--- a/artifacts/REV-04/build/message-template-library.docx
+++ b/artifacts/REV-04/build/message-template-library.docx
@@ -172,6 +172,14 @@
         <w:t xml:space="preserve">Every slot names exactly one column of one export, spelled the way that export’s header row spells it. A slot that names a column no export carries is not a slot at all, and the draft stops on it rather than guessing at a value or leaving the braces in the text for the recipient to find.</w:t>
       </w:r>
     </w:p>
+    <w:p>
+      <w:pPr>
+        <w:pStyle w:val="BodyText"/>
+      </w:pPr>
+      <w:r>
+        <w:t xml:space="preserve">The same rule covers two situations that can look like a filled slot but are not. Where the recipient is a person the export carries no row for at all, such as a signal about a new hire who has no customer relationship management record yet, every slot naming that person stays unfilled. Where the export does carry the row but the named column is blank for it, the slot stays unfilled the same way. Either way the draft stops there and names the missing input for the person reviewing it; no slot is ever filled from a guess.</w:t>
+      </w:r>
+    </w:p>
     <w:bookmarkEnd w:id="10"/>
     <w:bookmarkStart w:id="11" w:name="claims"/>
     <w:p>
@@ -244,6 +252,14 @@
         <w:t xml:space="preserve">Where the status is inferred, the drafter abstains. It records the missing input and stops, rather than writing to an address nobody has confirmed. Consent is a separate question, asked and answered before this one, and a permitted consent state does not make an unverified address usable.</w:t>
       </w:r>
     </w:p>
+    <w:p>
+      <w:pPr>
+        <w:pStyle w:val="BodyText"/>
+      </w:pPr>
+      <w:r>
+        <w:t xml:space="preserve">The re_engagement category carries a gate of its own, upstream of both of these: a re-engagement draft is only assembled after the suppression check on the account clears, and an account-level do-not-contact state ends the play before any draft exists.</w:t>
+      </w:r>
+    </w:p>
     <w:bookmarkEnd w:id="12"/>
     <w:bookmarkStart w:id="20" w:name="the-templates"/>
     <w:p>
@@ -608,19 +624,19 @@
         <w:rPr>
           <w:rStyle w:val="VerbatimChar"/>
         </w:rPr>
-        <w:t xml:space="preserve">We spoke last year about {{opportunity.opportunity_name}}, and {{account.name}} went a different way, which was a reasonable call on what the platform did at the time.</w:t>
-      </w:r>
-      <w:r>
-        <w:br/>
-      </w:r>
-      <w:r>
-        <w:br/>
-      </w:r>
-      <w:r>
-        <w:rPr>
-          <w:rStyle w:val="VerbatimChar"/>
-        </w:rPr>
-        <w:t xml:space="preserve">Two of the gaps your team named have closed since. Administrative actions are now written to a tenant audit log retained for twelve months, and single sign-on through SAML 2.0 with user provisioning through SCIM is available on every paid tier rather than only at the top of the range.</w:t>
+        <w:t xml:space="preserve">We spoke last year about a rollout at {{account.name}}, and the decision went a different way, which was a reasonable call on what the platform did at the time.</w:t>
+      </w:r>
+      <w:r>
+        <w:br/>
+      </w:r>
+      <w:r>
+        <w:br/>
+      </w:r>
+      <w:r>
+        <w:rPr>
+          <w:rStyle w:val="VerbatimChar"/>
+        </w:rPr>
+        <w:t xml:space="preserve">Administrative actions are written to a tenant audit log retained for twelve months, and single sign-on through SAML 2.0 with user provisioning through SCIM is available on every paid tier.</w:t>
       </w:r>
       <w:r>
         <w:br/>
@@ -723,7 +739,7 @@
         <w:rPr>
           <w:rStyle w:val="VerbatimChar"/>
         </w:rPr>
-        <w:t xml:space="preserve">Permissions inside the product are role based and your administrators hold them, not ours, and administrative actions are written to a tenant audit log retained for twelve months. On our own side, the corporate information technology environment holds a current Cyber Essentials certification, renewed each year, which covers the laptops and identity systems our support engineers work from.</w:t>
+        <w:t xml:space="preserve">Permissions inside the product are role based and your administrators hold them, not ours, and administrative actions are written to a tenant audit log retained for twelve months. On our own side, the corporate information technology environment holds a current Cyber Essentials certification, renewed each year.</w:t>
       </w:r>
       <w:r>
         <w:br/>
@@ -941,7 +957,7 @@
         <w:rPr>
           <w:rStyle w:val="VerbatimChar"/>
         </w:rPr>
-        <w:t xml:space="preserve">If that is familiar, reply with a time and I will show you the version of it closest to a {{account.segment}} team. If it is not, I will not write again.</w:t>
+        <w:t xml:space="preserve">If that is familiar, reply with a time and I will show you the version of it closest to a team in the {{account.segment}} band. If it is not, I will not write again.</w:t>
       </w:r>
       <w:r>
         <w:br/>

</xml_diff>

<commit_message>
fix(cluster-3): scoped re-review residuals R1 to R4 with reviewer copy
R1: the missing-input rule now states the draft is still written and
held, with the unfilled slot named beside it (the sidecar's abstain
vocabulary no longer leaks into the happy path). R2: the suppression
check stated as governing every category, with re_engagement as where it
most often decides. R3: spec C3-P5 reads null contact_id and null
company_domain, matching the bytes. R4: the T4 interplay assertion pins
dnc_effective_date to an ISO date so an empty value cannot pass the
comparison vacuously. Docx rebuilt, MANIFEST regenerated.

Co-Authored-By: Claude Fable 5 <noreply@anthropic.com>
Claude-Session: 7e82173b-3325-45bd-9117-a5fcd54fdd9f
</commit_message>
<xml_diff>
--- a/artifacts/REV-04/build/message-template-library.docx
+++ b/artifacts/REV-04/build/message-template-library.docx
@@ -177,7 +177,7 @@
         <w:pStyle w:val="BodyText"/>
       </w:pPr>
       <w:r>
-        <w:t xml:space="preserve">The same rule covers two situations that can look like a filled slot but are not. Where the recipient is a person the export carries no row for at all, such as a signal about a new hire who has no customer relationship management record yet, every slot naming that person stays unfilled. Where the export does carry the row but the named column is blank for it, the slot stays unfilled the same way. Either way the draft stops there and names the missing input for the person reviewing it; no slot is ever filled from a guess.</w:t>
+        <w:t xml:space="preserve">The same rule covers two situations that can look like a filled slot but are not. Where the recipient is a person the export carries no row for at all, such as a signal about a new hire who has no customer relationship management record yet, every slot naming that person stays unfilled. Where the export does carry the row but the named column is blank for it, the slot stays unfilled the same way. Either way the rest of the draft is still written and held for a person to read, with the unfilled slot and the missing input named beside it; no slot is ever filled from a guess.</w:t>
       </w:r>
     </w:p>
     <w:bookmarkEnd w:id="10"/>
@@ -257,7 +257,7 @@
         <w:pStyle w:val="BodyText"/>
       </w:pPr>
       <w:r>
-        <w:t xml:space="preserve">The re_engagement category carries a gate of its own, upstream of both of these: a re-engagement draft is only assembled after the suppression check on the account clears, and an account-level do-not-contact state ends the play before any draft exists.</w:t>
+        <w:t xml:space="preserve">Before either of those questions, the suppression check on the account runs, and it governs every category: an account-level do-not-contact state ends the play before any draft is written. The re_engagement category is where that check most often decides the outcome, because an account that went a different way is also the one most likely to carry such a state.</w:t>
       </w:r>
     </w:p>
     <w:bookmarkEnd w:id="12"/>

</xml_diff>